<commit_message>
Add comprehensive figures and charts to APA-formatted research paper
Added 10 figures with proper APA captions and data sources:

BAR CHARTS (5):
- Figure 1: Sharpe Ratio Comparison (signal strategy 1.0909 > linear 0.2804 > LSTM 0.1459)
- Figure 2: Best Model by Ticker Count (linear 11/29, LSTM 10/29)
- Figure 4: CAGR Comparison (signal 21% > linear 4.46% > others negative)
- Figure 5: Max Drawdown Comparison (−47% to −59%)
- Figure 3: Prediction Error (MAE vs RMSE) - LSTM lowest error but not best Sharpe

PREDICTION ACCURACY SCATTER PLOTS (5):
- Figure 6: Linear regression predictions vs actual
- Figure 7: Polynomial regression predictions vs actual
- Figure 8: Random Forest predictions vs actual
- Figure 9: Gradient Boosting predictions vs actual
- Figure 10: LSTM predictions vs actual

All figures include detailed captions explaining what is shown, the interpretation, and data sources per APA guidelines.
</commit_message>
<xml_diff>
--- a/Research_Paper_APA_Format.docx
+++ b/Research_Paper_APA_Format.docx
@@ -564,6 +564,59 @@
     <w:p/>
     <w:p>
       <w:pPr>
+        <w:jc w:val="center"/>
+      </w:pPr>
+      <w:r>
+        <w:drawing>
+          <wp:inline xmlns:a="http://schemas.openxmlformats.org/drawingml/2006/main" xmlns:pic="http://schemas.openxmlformats.org/drawingml/2006/picture">
+            <wp:extent cx="5029200" cy="2989693"/>
+            <wp:docPr id="1" name="Picture 1"/>
+            <wp:cNvGraphicFramePr>
+              <a:graphicFrameLocks noChangeAspect="1"/>
+            </wp:cNvGraphicFramePr>
+            <a:graphic>
+              <a:graphicData uri="http://schemas.openxmlformats.org/drawingml/2006/picture">
+                <pic:pic>
+                  <pic:nvPicPr>
+                    <pic:cNvPr id="0" name="Sharpe_Ratio_Comparison.png"/>
+                    <pic:cNvPicPr/>
+                  </pic:nvPicPr>
+                  <pic:blipFill>
+                    <a:blip r:embed="rId10"/>
+                    <a:stretch>
+                      <a:fillRect/>
+                    </a:stretch>
+                  </pic:blipFill>
+                  <pic:spPr>
+                    <a:xfrm>
+                      <a:off x="0" y="0"/>
+                      <a:ext cx="5029200" cy="2989693"/>
+                    </a:xfrm>
+                    <a:prstGeom prst="rect"/>
+                  </pic:spPr>
+                </pic:pic>
+              </a:graphicData>
+            </a:graphic>
+          </wp:inline>
+        </w:drawing>
+      </w:r>
+    </w:p>
+    <w:p>
+      <w:pPr>
+        <w:spacing w:line="480" w:lineRule="auto"/>
+      </w:pPr>
+      <w:r>
+        <w:rPr>
+          <w:rFonts w:ascii="Times New Roman" w:hAnsi="Times New Roman"/>
+          <w:b/>
+          <w:sz w:val="24"/>
+        </w:rPr>
+        <w:t>Figure 1. Risk-adjusted returns (Sharpe ratio) by model. The signal strategy achieved the highest Sharpe ratio (1.0909), followed by linear regression (0.2804). More complex models achieved lower or negative Sharpe ratios. Source: Author's calculations based on 163,513 daily observations across 29 equities, 2020–2025 test period.</w:t>
+      </w:r>
+    </w:p>
+    <w:p/>
+    <w:p>
+      <w:pPr>
         <w:spacing w:line="480" w:lineRule="auto"/>
         <w:jc w:val="left"/>
       </w:pPr>
@@ -587,6 +640,59 @@
           <w:sz w:val="24"/>
         </w:rPr>
         <w:t>Results at the individual equity level reveal substantial heterogeneity across instruments. Linear regression was the best-performing model (highest Sharpe ratio) for 11 of 29 equities, while LSTM was best for 10 equities. Polynomial regression was best for 5 equities, Random Forest for 2, and Gradient Boosting for only 1 equity. LSTM's best performances were concentrated in equities with strong trend-following characteristics, including COST (Sharpe 1.002), GS (Sharpe 1.085), JPM (Sharpe 1.038), and TSLA (Sharpe 0.9998). These results suggest that LSTM's temporal learning is particularly effective for certain asset classes but does not provide universal improvement across all equities (Rafferty, 2026).</w:t>
+      </w:r>
+    </w:p>
+    <w:p/>
+    <w:p>
+      <w:pPr>
+        <w:jc w:val="center"/>
+      </w:pPr>
+      <w:r>
+        <w:drawing>
+          <wp:inline xmlns:a="http://schemas.openxmlformats.org/drawingml/2006/main" xmlns:pic="http://schemas.openxmlformats.org/drawingml/2006/picture">
+            <wp:extent cx="5029200" cy="2989693"/>
+            <wp:docPr id="2" name="Picture 2"/>
+            <wp:cNvGraphicFramePr>
+              <a:graphicFrameLocks noChangeAspect="1"/>
+            </wp:cNvGraphicFramePr>
+            <a:graphic>
+              <a:graphicData uri="http://schemas.openxmlformats.org/drawingml/2006/picture">
+                <pic:pic>
+                  <pic:nvPicPr>
+                    <pic:cNvPr id="0" name="Best_Model_by_Ticker.png"/>
+                    <pic:cNvPicPr/>
+                  </pic:nvPicPr>
+                  <pic:blipFill>
+                    <a:blip r:embed="rId11"/>
+                    <a:stretch>
+                      <a:fillRect/>
+                    </a:stretch>
+                  </pic:blipFill>
+                  <pic:spPr>
+                    <a:xfrm>
+                      <a:off x="0" y="0"/>
+                      <a:ext cx="5029200" cy="2989693"/>
+                    </a:xfrm>
+                    <a:prstGeom prst="rect"/>
+                  </pic:spPr>
+                </pic:pic>
+              </a:graphicData>
+            </a:graphic>
+          </wp:inline>
+        </w:drawing>
+      </w:r>
+    </w:p>
+    <w:p>
+      <w:pPr>
+        <w:spacing w:line="480" w:lineRule="auto"/>
+      </w:pPr>
+      <w:r>
+        <w:rPr>
+          <w:rFonts w:ascii="Times New Roman" w:hAnsi="Times New Roman"/>
+          <w:b/>
+          <w:sz w:val="24"/>
+        </w:rPr>
+        <w:t>Figure 2. Number of equities (out of 29) where each model achieved the highest Sharpe ratio. Linear regression performed best for 11 tickers, LSTM for 10 tickers, and more complex models for fewer tickers. Source: Author's calculations.</w:t>
       </w:r>
     </w:p>
     <w:p/>
@@ -617,6 +723,467 @@
         <w:t>A critical finding is the disconnect between prediction accuracy and trading profitability. LSTM achieved the lowest prediction error (MAE 0.0152, RMSE 0.0214) but only the third-best Sharpe ratio. Conversely, Linear regression had the fourth-lowest MAE (0.0172) but the second-best Sharpe ratio. This discrepancy arises because accurate predictions do not automatically yield profitable trading signals when predictions are noisy, correlate with volatility, or apply uniformly to heterogeneous assets. The results highlight a central lesson in quantitative finance: reducing prediction error is necessary but not sufficient for trading success (Rafferty, 2026).</w:t>
       </w:r>
     </w:p>
+    <w:p/>
+    <w:p>
+      <w:pPr>
+        <w:jc w:val="center"/>
+      </w:pPr>
+      <w:r>
+        <w:drawing>
+          <wp:inline xmlns:a="http://schemas.openxmlformats.org/drawingml/2006/main" xmlns:pic="http://schemas.openxmlformats.org/drawingml/2006/picture">
+            <wp:extent cx="5029200" cy="2996480"/>
+            <wp:docPr id="3" name="Picture 3"/>
+            <wp:cNvGraphicFramePr>
+              <a:graphicFrameLocks noChangeAspect="1"/>
+            </wp:cNvGraphicFramePr>
+            <a:graphic>
+              <a:graphicData uri="http://schemas.openxmlformats.org/drawingml/2006/picture">
+                <pic:pic>
+                  <pic:nvPicPr>
+                    <pic:cNvPr id="0" name="Prediction_Error_Comparison.png"/>
+                    <pic:cNvPicPr/>
+                  </pic:nvPicPr>
+                  <pic:blipFill>
+                    <a:blip r:embed="rId12"/>
+                    <a:stretch>
+                      <a:fillRect/>
+                    </a:stretch>
+                  </pic:blipFill>
+                  <pic:spPr>
+                    <a:xfrm>
+                      <a:off x="0" y="0"/>
+                      <a:ext cx="5029200" cy="2996480"/>
+                    </a:xfrm>
+                    <a:prstGeom prst="rect"/>
+                  </pic:spPr>
+                </pic:pic>
+              </a:graphicData>
+            </a:graphic>
+          </wp:inline>
+        </w:drawing>
+      </w:r>
+    </w:p>
+    <w:p>
+      <w:pPr>
+        <w:spacing w:line="480" w:lineRule="auto"/>
+      </w:pPr>
+      <w:r>
+        <w:rPr>
+          <w:rFonts w:ascii="Times New Roman" w:hAnsi="Times New Roman"/>
+          <w:b/>
+          <w:sz w:val="24"/>
+        </w:rPr>
+        <w:t>Figure 3. Mean Absolute Error (MAE) and Root Mean Squared Error (RMSE) by model. LSTM achieved the lowest prediction errors, yet did not translate to the highest Sharpe ratio. This highlights the disconnect between prediction accuracy and trading profitability. Source: Author's calculations.</w:t>
+      </w:r>
+    </w:p>
+    <w:p/>
+    <w:p/>
+    <w:p>
+      <w:pPr>
+        <w:jc w:val="center"/>
+      </w:pPr>
+      <w:r>
+        <w:drawing>
+          <wp:inline xmlns:a="http://schemas.openxmlformats.org/drawingml/2006/main" xmlns:pic="http://schemas.openxmlformats.org/drawingml/2006/picture">
+            <wp:extent cx="5029200" cy="2989693"/>
+            <wp:docPr id="4" name="Picture 4"/>
+            <wp:cNvGraphicFramePr>
+              <a:graphicFrameLocks noChangeAspect="1"/>
+            </wp:cNvGraphicFramePr>
+            <a:graphic>
+              <a:graphicData uri="http://schemas.openxmlformats.org/drawingml/2006/picture">
+                <pic:pic>
+                  <pic:nvPicPr>
+                    <pic:cNvPr id="0" name="CAGR_Comparison.png"/>
+                    <pic:cNvPicPr/>
+                  </pic:nvPicPr>
+                  <pic:blipFill>
+                    <a:blip r:embed="rId13"/>
+                    <a:stretch>
+                      <a:fillRect/>
+                    </a:stretch>
+                  </pic:blipFill>
+                  <pic:spPr>
+                    <a:xfrm>
+                      <a:off x="0" y="0"/>
+                      <a:ext cx="5029200" cy="2989693"/>
+                    </a:xfrm>
+                    <a:prstGeom prst="rect"/>
+                  </pic:spPr>
+                </pic:pic>
+              </a:graphicData>
+            </a:graphic>
+          </wp:inline>
+        </w:drawing>
+      </w:r>
+    </w:p>
+    <w:p>
+      <w:pPr>
+        <w:spacing w:line="480" w:lineRule="auto"/>
+      </w:pPr>
+      <w:r>
+        <w:rPr>
+          <w:rFonts w:ascii="Times New Roman" w:hAnsi="Times New Roman"/>
+          <w:b/>
+          <w:sz w:val="24"/>
+        </w:rPr>
+        <w:t>Figure 4. Compound Annual Growth Rate (CAGR) by model. The signal strategy achieved approximately 21% annualized returns, followed by linear regression at 4.46%. More complex models achieved negative returns. Source: Author's calculations.</w:t>
+      </w:r>
+    </w:p>
+    <w:p/>
+    <w:p/>
+    <w:p>
+      <w:pPr>
+        <w:jc w:val="center"/>
+      </w:pPr>
+      <w:r>
+        <w:drawing>
+          <wp:inline xmlns:a="http://schemas.openxmlformats.org/drawingml/2006/main" xmlns:pic="http://schemas.openxmlformats.org/drawingml/2006/picture">
+            <wp:extent cx="5029200" cy="2989693"/>
+            <wp:docPr id="5" name="Picture 5"/>
+            <wp:cNvGraphicFramePr>
+              <a:graphicFrameLocks noChangeAspect="1"/>
+            </wp:cNvGraphicFramePr>
+            <a:graphic>
+              <a:graphicData uri="http://schemas.openxmlformats.org/drawingml/2006/picture">
+                <pic:pic>
+                  <pic:nvPicPr>
+                    <pic:cNvPr id="0" name="Max_Drawdown_Comparison.png"/>
+                    <pic:cNvPicPr/>
+                  </pic:nvPicPr>
+                  <pic:blipFill>
+                    <a:blip r:embed="rId14"/>
+                    <a:stretch>
+                      <a:fillRect/>
+                    </a:stretch>
+                  </pic:blipFill>
+                  <pic:spPr>
+                    <a:xfrm>
+                      <a:off x="0" y="0"/>
+                      <a:ext cx="5029200" cy="2989693"/>
+                    </a:xfrm>
+                    <a:prstGeom prst="rect"/>
+                  </pic:spPr>
+                </pic:pic>
+              </a:graphicData>
+            </a:graphic>
+          </wp:inline>
+        </w:drawing>
+      </w:r>
+    </w:p>
+    <w:p>
+      <w:pPr>
+        <w:spacing w:line="480" w:lineRule="auto"/>
+      </w:pPr>
+      <w:r>
+        <w:rPr>
+          <w:rFonts w:ascii="Times New Roman" w:hAnsi="Times New Roman"/>
+          <w:b/>
+          <w:sz w:val="24"/>
+        </w:rPr>
+        <w:t>Figure 5. Maximum drawdown (largest peak-to-trough decline) by model. All strategies experienced drawdowns between −47% and −59%, indicating substantial volatility across all approaches. Source: Author's calculations.</w:t>
+      </w:r>
+    </w:p>
+    <w:p/>
+    <w:p>
+      <w:r>
+        <w:br w:type="page"/>
+      </w:r>
+    </w:p>
+    <w:p>
+      <w:pPr>
+        <w:spacing w:line="480" w:lineRule="auto"/>
+        <w:jc w:val="center"/>
+      </w:pPr>
+      <w:r>
+        <w:rPr>
+          <w:rFonts w:ascii="Times New Roman" w:hAnsi="Times New Roman"/>
+          <w:b/>
+          <w:sz w:val="24"/>
+        </w:rPr>
+        <w:t>Prediction Accuracy Graphs</w:t>
+      </w:r>
+    </w:p>
+    <w:p/>
+    <w:p>
+      <w:pPr>
+        <w:spacing w:line="480" w:lineRule="auto"/>
+        <w:ind w:firstLine="720"/>
+      </w:pPr>
+      <w:r>
+        <w:rPr>
+          <w:rFonts w:ascii="Times New Roman" w:hAnsi="Times New Roman"/>
+          <w:sz w:val="24"/>
+        </w:rPr>
+        <w:t>The following figures display predicted returns versus actual returns for each machine learning model. These scatter plots reveal the accuracy of each model's predictions and identify systematic biases. Models with predictions clustered near the 45-degree line (y = x) have accurate predictions; models with predictions far from this line have systematic errors or high variance.</w:t>
+      </w:r>
+    </w:p>
+    <w:p/>
+    <w:p>
+      <w:pPr>
+        <w:jc w:val="center"/>
+      </w:pPr>
+      <w:r>
+        <w:drawing>
+          <wp:inline xmlns:a="http://schemas.openxmlformats.org/drawingml/2006/main" xmlns:pic="http://schemas.openxmlformats.org/drawingml/2006/picture">
+            <wp:extent cx="5029200" cy="3017520"/>
+            <wp:docPr id="6" name="Picture 6"/>
+            <wp:cNvGraphicFramePr>
+              <a:graphicFrameLocks noChangeAspect="1"/>
+            </wp:cNvGraphicFramePr>
+            <a:graphic>
+              <a:graphicData uri="http://schemas.openxmlformats.org/drawingml/2006/picture">
+                <pic:pic>
+                  <pic:nvPicPr>
+                    <pic:cNvPr id="0" name="Linear_pred_vs_actual.png"/>
+                    <pic:cNvPicPr/>
+                  </pic:nvPicPr>
+                  <pic:blipFill>
+                    <a:blip r:embed="rId15"/>
+                    <a:stretch>
+                      <a:fillRect/>
+                    </a:stretch>
+                  </pic:blipFill>
+                  <pic:spPr>
+                    <a:xfrm>
+                      <a:off x="0" y="0"/>
+                      <a:ext cx="5029200" cy="3017520"/>
+                    </a:xfrm>
+                    <a:prstGeom prst="rect"/>
+                  </pic:spPr>
+                </pic:pic>
+              </a:graphicData>
+            </a:graphic>
+          </wp:inline>
+        </w:drawing>
+      </w:r>
+    </w:p>
+    <w:p>
+      <w:pPr>
+        <w:spacing w:line="480" w:lineRule="auto"/>
+      </w:pPr>
+      <w:r>
+        <w:rPr>
+          <w:rFonts w:ascii="Times New Roman" w:hAnsi="Times New Roman"/>
+          <w:b/>
+          <w:sz w:val="24"/>
+        </w:rPr>
+        <w:t>Figure 6. Linear regression predicted returns versus actual returns. The linear model shows reasonable accuracy with scattered predictions around the 45-degree line, indicating that it captures systematic price movements without severe overfitting. Source: Author's predictions on test set (2020–2025).</w:t>
+      </w:r>
+    </w:p>
+    <w:p/>
+    <w:p>
+      <w:pPr>
+        <w:jc w:val="center"/>
+      </w:pPr>
+      <w:r>
+        <w:drawing>
+          <wp:inline xmlns:a="http://schemas.openxmlformats.org/drawingml/2006/main" xmlns:pic="http://schemas.openxmlformats.org/drawingml/2006/picture">
+            <wp:extent cx="5029200" cy="3017520"/>
+            <wp:docPr id="7" name="Picture 7"/>
+            <wp:cNvGraphicFramePr>
+              <a:graphicFrameLocks noChangeAspect="1"/>
+            </wp:cNvGraphicFramePr>
+            <a:graphic>
+              <a:graphicData uri="http://schemas.openxmlformats.org/drawingml/2006/picture">
+                <pic:pic>
+                  <pic:nvPicPr>
+                    <pic:cNvPr id="0" name="Polynomial_pred_vs_actual.png"/>
+                    <pic:cNvPicPr/>
+                  </pic:nvPicPr>
+                  <pic:blipFill>
+                    <a:blip r:embed="rId16"/>
+                    <a:stretch>
+                      <a:fillRect/>
+                    </a:stretch>
+                  </pic:blipFill>
+                  <pic:spPr>
+                    <a:xfrm>
+                      <a:off x="0" y="0"/>
+                      <a:ext cx="5029200" cy="3017520"/>
+                    </a:xfrm>
+                    <a:prstGeom prst="rect"/>
+                  </pic:spPr>
+                </pic:pic>
+              </a:graphicData>
+            </a:graphic>
+          </wp:inline>
+        </w:drawing>
+      </w:r>
+    </w:p>
+    <w:p>
+      <w:pPr>
+        <w:spacing w:line="480" w:lineRule="auto"/>
+      </w:pPr>
+      <w:r>
+        <w:rPr>
+          <w:rFonts w:ascii="Times New Roman" w:hAnsi="Times New Roman"/>
+          <w:b/>
+          <w:sz w:val="24"/>
+        </w:rPr>
+        <w:t>Figure 7. Polynomial regression predicted returns versus actual returns. Predictions show greater scatter relative to linear regression, suggesting that polynomial feature interactions do not materially improve prediction accuracy while increasing risk of overfitting. Source: Author's predictions on test set (2020–2025).</w:t>
+      </w:r>
+    </w:p>
+    <w:p/>
+    <w:p>
+      <w:pPr>
+        <w:jc w:val="center"/>
+      </w:pPr>
+      <w:r>
+        <w:drawing>
+          <wp:inline xmlns:a="http://schemas.openxmlformats.org/drawingml/2006/main" xmlns:pic="http://schemas.openxmlformats.org/drawingml/2006/picture">
+            <wp:extent cx="5029200" cy="3017520"/>
+            <wp:docPr id="8" name="Picture 8"/>
+            <wp:cNvGraphicFramePr>
+              <a:graphicFrameLocks noChangeAspect="1"/>
+            </wp:cNvGraphicFramePr>
+            <a:graphic>
+              <a:graphicData uri="http://schemas.openxmlformats.org/drawingml/2006/picture">
+                <pic:pic>
+                  <pic:nvPicPr>
+                    <pic:cNvPr id="0" name="RandomForest_pred_vs_actual.png"/>
+                    <pic:cNvPicPr/>
+                  </pic:nvPicPr>
+                  <pic:blipFill>
+                    <a:blip r:embed="rId17"/>
+                    <a:stretch>
+                      <a:fillRect/>
+                    </a:stretch>
+                  </pic:blipFill>
+                  <pic:spPr>
+                    <a:xfrm>
+                      <a:off x="0" y="0"/>
+                      <a:ext cx="5029200" cy="3017520"/>
+                    </a:xfrm>
+                    <a:prstGeom prst="rect"/>
+                  </pic:spPr>
+                </pic:pic>
+              </a:graphicData>
+            </a:graphic>
+          </wp:inline>
+        </w:drawing>
+      </w:r>
+    </w:p>
+    <w:p>
+      <w:pPr>
+        <w:spacing w:line="480" w:lineRule="auto"/>
+      </w:pPr>
+      <w:r>
+        <w:rPr>
+          <w:rFonts w:ascii="Times New Roman" w:hAnsi="Times New Roman"/>
+          <w:b/>
+          <w:sz w:val="24"/>
+        </w:rPr>
+        <w:t>Figure 8. Random Forest predicted returns versus actual returns. Predictions are widely scattered with no clear clustering around the 45-degree line, indicating poor generalization from training to test data. This scatter suggests overfitting to training data. Source: Author's predictions on test set (2020–2025).</w:t>
+      </w:r>
+    </w:p>
+    <w:p/>
+    <w:p>
+      <w:pPr>
+        <w:jc w:val="center"/>
+      </w:pPr>
+      <w:r>
+        <w:drawing>
+          <wp:inline xmlns:a="http://schemas.openxmlformats.org/drawingml/2006/main" xmlns:pic="http://schemas.openxmlformats.org/drawingml/2006/picture">
+            <wp:extent cx="5029200" cy="3017520"/>
+            <wp:docPr id="9" name="Picture 9"/>
+            <wp:cNvGraphicFramePr>
+              <a:graphicFrameLocks noChangeAspect="1"/>
+            </wp:cNvGraphicFramePr>
+            <a:graphic>
+              <a:graphicData uri="http://schemas.openxmlformats.org/drawingml/2006/picture">
+                <pic:pic>
+                  <pic:nvPicPr>
+                    <pic:cNvPr id="0" name="GradientBoosting_pred_vs_actual.png"/>
+                    <pic:cNvPicPr/>
+                  </pic:nvPicPr>
+                  <pic:blipFill>
+                    <a:blip r:embed="rId18"/>
+                    <a:stretch>
+                      <a:fillRect/>
+                    </a:stretch>
+                  </pic:blipFill>
+                  <pic:spPr>
+                    <a:xfrm>
+                      <a:off x="0" y="0"/>
+                      <a:ext cx="5029200" cy="3017520"/>
+                    </a:xfrm>
+                    <a:prstGeom prst="rect"/>
+                  </pic:spPr>
+                </pic:pic>
+              </a:graphicData>
+            </a:graphic>
+          </wp:inline>
+        </w:drawing>
+      </w:r>
+    </w:p>
+    <w:p>
+      <w:pPr>
+        <w:spacing w:line="480" w:lineRule="auto"/>
+      </w:pPr>
+      <w:r>
+        <w:rPr>
+          <w:rFonts w:ascii="Times New Roman" w:hAnsi="Times New Roman"/>
+          <w:b/>
+          <w:sz w:val="24"/>
+        </w:rPr>
+        <w:t>Figure 9. Gradient Boosting predicted returns versus actual returns. Similar to Random Forest, predictions are scattered with no clear correlation to actual returns, suggesting severe overfitting and poor out-of-sample generalization. Source: Author's predictions on test set (2020–2025).</w:t>
+      </w:r>
+    </w:p>
+    <w:p/>
+    <w:p>
+      <w:pPr>
+        <w:jc w:val="center"/>
+      </w:pPr>
+      <w:r>
+        <w:drawing>
+          <wp:inline xmlns:a="http://schemas.openxmlformats.org/drawingml/2006/main" xmlns:pic="http://schemas.openxmlformats.org/drawingml/2006/picture">
+            <wp:extent cx="5029200" cy="3017520"/>
+            <wp:docPr id="10" name="Picture 10"/>
+            <wp:cNvGraphicFramePr>
+              <a:graphicFrameLocks noChangeAspect="1"/>
+            </wp:cNvGraphicFramePr>
+            <a:graphic>
+              <a:graphicData uri="http://schemas.openxmlformats.org/drawingml/2006/picture">
+                <pic:pic>
+                  <pic:nvPicPr>
+                    <pic:cNvPr id="0" name="LSTM_pred_vs_actual.png"/>
+                    <pic:cNvPicPr/>
+                  </pic:nvPicPr>
+                  <pic:blipFill>
+                    <a:blip r:embed="rId19"/>
+                    <a:stretch>
+                      <a:fillRect/>
+                    </a:stretch>
+                  </pic:blipFill>
+                  <pic:spPr>
+                    <a:xfrm>
+                      <a:off x="0" y="0"/>
+                      <a:ext cx="5029200" cy="3017520"/>
+                    </a:xfrm>
+                    <a:prstGeom prst="rect"/>
+                  </pic:spPr>
+                </pic:pic>
+              </a:graphicData>
+            </a:graphic>
+          </wp:inline>
+        </w:drawing>
+      </w:r>
+    </w:p>
+    <w:p>
+      <w:pPr>
+        <w:spacing w:line="480" w:lineRule="auto"/>
+      </w:pPr>
+      <w:r>
+        <w:rPr>
+          <w:rFonts w:ascii="Times New Roman" w:hAnsi="Times New Roman"/>
+          <w:b/>
+          <w:sz w:val="24"/>
+        </w:rPr>
+        <w:t>Figure 10. LSTM predicted returns versus actual returns. Despite achieving the lowest MAE and RMSE, LSTM predictions show substantial scatter, indicating that high accuracy in absolute error terms does not translate to tight prediction clusters. This explains why LSTM did not achieve the highest Sharpe ratio despite best-in-class accuracy metrics. Source: Author's predictions on test set (2020–2025).</w:t>
+      </w:r>
+    </w:p>
+    <w:p/>
     <w:p>
       <w:r>
         <w:br w:type="page"/>

</xml_diff>